<commit_message>
Update Origo Globe Plugin - How To.docx
</commit_message>
<xml_diff>
--- a/FME/3D-modeller/Origo Globe Plugin - How To.docx
+++ b/FME/3D-modeller/Origo Globe Plugin - How To.docx
@@ -2330,7 +2330,7 @@
         </w:rPr>
         <w:fldChar w:fldCharType="separate"/>
       </w:r>
-      <w:hyperlink w:anchor="_Toc230779714" w:history="1">
+      <w:hyperlink w:anchor="_Toc230783536" w:history="1">
         <w:r>
           <w:rPr>
             <w:rStyle w:val="Hyperlnk"/>
@@ -2376,7 +2376,7 @@
             <w:noProof/>
             <w:webHidden/>
           </w:rPr>
-          <w:instrText xml:space="preserve"> PAGEREF _Toc230779714 \h </w:instrText>
+          <w:instrText xml:space="preserve"> PAGEREF _Toc230783536 \h </w:instrText>
         </w:r>
         <w:r>
           <w:rPr>
@@ -2420,7 +2420,7 @@
           <w14:ligatures w14:val="standardContextual"/>
         </w:rPr>
       </w:pPr>
-      <w:hyperlink w:anchor="_Toc230779715" w:history="1">
+      <w:hyperlink w:anchor="_Toc230783537" w:history="1">
         <w:r>
           <w:rPr>
             <w:rStyle w:val="Hyperlnk"/>
@@ -2466,7 +2466,7 @@
             <w:noProof/>
             <w:webHidden/>
           </w:rPr>
-          <w:instrText xml:space="preserve"> PAGEREF _Toc230779715 \h </w:instrText>
+          <w:instrText xml:space="preserve"> PAGEREF _Toc230783537 \h </w:instrText>
         </w:r>
         <w:r>
           <w:rPr>
@@ -2510,7 +2510,7 @@
           <w14:ligatures w14:val="standardContextual"/>
         </w:rPr>
       </w:pPr>
-      <w:hyperlink w:anchor="_Toc230779716" w:history="1">
+      <w:hyperlink w:anchor="_Toc230783538" w:history="1">
         <w:r>
           <w:rPr>
             <w:rStyle w:val="Hyperlnk"/>
@@ -2556,7 +2556,7 @@
             <w:noProof/>
             <w:webHidden/>
           </w:rPr>
-          <w:instrText xml:space="preserve"> PAGEREF _Toc230779716 \h </w:instrText>
+          <w:instrText xml:space="preserve"> PAGEREF _Toc230783538 \h </w:instrText>
         </w:r>
         <w:r>
           <w:rPr>
@@ -2600,7 +2600,7 @@
           <w14:ligatures w14:val="standardContextual"/>
         </w:rPr>
       </w:pPr>
-      <w:hyperlink w:anchor="_Toc230779717" w:history="1">
+      <w:hyperlink w:anchor="_Toc230783539" w:history="1">
         <w:r>
           <w:rPr>
             <w:rStyle w:val="Hyperlnk"/>
@@ -2646,7 +2646,7 @@
             <w:noProof/>
             <w:webHidden/>
           </w:rPr>
-          <w:instrText xml:space="preserve"> PAGEREF _Toc230779717 \h </w:instrText>
+          <w:instrText xml:space="preserve"> PAGEREF _Toc230783539 \h </w:instrText>
         </w:r>
         <w:r>
           <w:rPr>
@@ -2690,7 +2690,7 @@
           <w14:ligatures w14:val="standardContextual"/>
         </w:rPr>
       </w:pPr>
-      <w:hyperlink w:anchor="_Toc230779718" w:history="1">
+      <w:hyperlink w:anchor="_Toc230783540" w:history="1">
         <w:r>
           <w:rPr>
             <w:rStyle w:val="Hyperlnk"/>
@@ -2736,7 +2736,7 @@
             <w:noProof/>
             <w:webHidden/>
           </w:rPr>
-          <w:instrText xml:space="preserve"> PAGEREF _Toc230779718 \h </w:instrText>
+          <w:instrText xml:space="preserve"> PAGEREF _Toc230783540 \h </w:instrText>
         </w:r>
         <w:r>
           <w:rPr>
@@ -2780,7 +2780,7 @@
           <w14:ligatures w14:val="standardContextual"/>
         </w:rPr>
       </w:pPr>
-      <w:hyperlink w:anchor="_Toc230779719" w:history="1">
+      <w:hyperlink w:anchor="_Toc230783541" w:history="1">
         <w:r>
           <w:rPr>
             <w:rStyle w:val="Hyperlnk"/>
@@ -2826,7 +2826,7 @@
             <w:noProof/>
             <w:webHidden/>
           </w:rPr>
-          <w:instrText xml:space="preserve"> PAGEREF _Toc230779719 \h </w:instrText>
+          <w:instrText xml:space="preserve"> PAGEREF _Toc230783541 \h </w:instrText>
         </w:r>
         <w:r>
           <w:rPr>
@@ -2870,7 +2870,7 @@
           <w14:ligatures w14:val="standardContextual"/>
         </w:rPr>
       </w:pPr>
-      <w:hyperlink w:anchor="_Toc230779720" w:history="1">
+      <w:hyperlink w:anchor="_Toc230783542" w:history="1">
         <w:r>
           <w:rPr>
             <w:rStyle w:val="Hyperlnk"/>
@@ -2916,7 +2916,7 @@
             <w:noProof/>
             <w:webHidden/>
           </w:rPr>
-          <w:instrText xml:space="preserve"> PAGEREF _Toc230779720 \h </w:instrText>
+          <w:instrText xml:space="preserve"> PAGEREF _Toc230783542 \h </w:instrText>
         </w:r>
         <w:r>
           <w:rPr>
@@ -2960,7 +2960,7 @@
           <w14:ligatures w14:val="standardContextual"/>
         </w:rPr>
       </w:pPr>
-      <w:hyperlink w:anchor="_Toc230779721" w:history="1">
+      <w:hyperlink w:anchor="_Toc230783543" w:history="1">
         <w:r>
           <w:rPr>
             <w:rStyle w:val="Hyperlnk"/>
@@ -3006,7 +3006,7 @@
             <w:noProof/>
             <w:webHidden/>
           </w:rPr>
-          <w:instrText xml:space="preserve"> PAGEREF _Toc230779721 \h </w:instrText>
+          <w:instrText xml:space="preserve"> PAGEREF _Toc230783543 \h </w:instrText>
         </w:r>
         <w:r>
           <w:rPr>
@@ -3050,7 +3050,7 @@
           <w14:ligatures w14:val="standardContextual"/>
         </w:rPr>
       </w:pPr>
-      <w:hyperlink w:anchor="_Toc230779722" w:history="1">
+      <w:hyperlink w:anchor="_Toc230783544" w:history="1">
         <w:r>
           <w:rPr>
             <w:rStyle w:val="Hyperlnk"/>
@@ -3096,7 +3096,7 @@
             <w:noProof/>
             <w:webHidden/>
           </w:rPr>
-          <w:instrText xml:space="preserve"> PAGEREF _Toc230779722 \h </w:instrText>
+          <w:instrText xml:space="preserve"> PAGEREF _Toc230783544 \h </w:instrText>
         </w:r>
         <w:r>
           <w:rPr>
@@ -3140,7 +3140,7 @@
           <w14:ligatures w14:val="standardContextual"/>
         </w:rPr>
       </w:pPr>
-      <w:hyperlink w:anchor="_Toc230779723" w:history="1">
+      <w:hyperlink w:anchor="_Toc230783545" w:history="1">
         <w:r>
           <w:rPr>
             <w:rStyle w:val="Hyperlnk"/>
@@ -3186,7 +3186,7 @@
             <w:noProof/>
             <w:webHidden/>
           </w:rPr>
-          <w:instrText xml:space="preserve"> PAGEREF _Toc230779723 \h </w:instrText>
+          <w:instrText xml:space="preserve"> PAGEREF _Toc230783545 \h </w:instrText>
         </w:r>
         <w:r>
           <w:rPr>
@@ -3230,7 +3230,7 @@
           <w14:ligatures w14:val="standardContextual"/>
         </w:rPr>
       </w:pPr>
-      <w:hyperlink w:anchor="_Toc230779724" w:history="1">
+      <w:hyperlink w:anchor="_Toc230783546" w:history="1">
         <w:r>
           <w:rPr>
             <w:rStyle w:val="Hyperlnk"/>
@@ -3276,7 +3276,7 @@
             <w:noProof/>
             <w:webHidden/>
           </w:rPr>
-          <w:instrText xml:space="preserve"> PAGEREF _Toc230779724 \h </w:instrText>
+          <w:instrText xml:space="preserve"> PAGEREF _Toc230783546 \h </w:instrText>
         </w:r>
         <w:r>
           <w:rPr>
@@ -3320,7 +3320,7 @@
           <w14:ligatures w14:val="standardContextual"/>
         </w:rPr>
       </w:pPr>
-      <w:hyperlink w:anchor="_Toc230779725" w:history="1">
+      <w:hyperlink w:anchor="_Toc230783547" w:history="1">
         <w:r>
           <w:rPr>
             <w:rStyle w:val="Hyperlnk"/>
@@ -3366,7 +3366,7 @@
             <w:noProof/>
             <w:webHidden/>
           </w:rPr>
-          <w:instrText xml:space="preserve"> PAGEREF _Toc230779725 \h </w:instrText>
+          <w:instrText xml:space="preserve"> PAGEREF _Toc230783547 \h </w:instrText>
         </w:r>
         <w:r>
           <w:rPr>
@@ -3410,7 +3410,7 @@
           <w14:ligatures w14:val="standardContextual"/>
         </w:rPr>
       </w:pPr>
-      <w:hyperlink w:anchor="_Toc230779726" w:history="1">
+      <w:hyperlink w:anchor="_Toc230783548" w:history="1">
         <w:r>
           <w:rPr>
             <w:rStyle w:val="Hyperlnk"/>
@@ -3456,7 +3456,7 @@
             <w:noProof/>
             <w:webHidden/>
           </w:rPr>
-          <w:instrText xml:space="preserve"> PAGEREF _Toc230779726 \h </w:instrText>
+          <w:instrText xml:space="preserve"> PAGEREF _Toc230783548 \h </w:instrText>
         </w:r>
         <w:r>
           <w:rPr>
@@ -3500,7 +3500,7 @@
           <w14:ligatures w14:val="standardContextual"/>
         </w:rPr>
       </w:pPr>
-      <w:hyperlink w:anchor="_Toc230779727" w:history="1">
+      <w:hyperlink w:anchor="_Toc230783549" w:history="1">
         <w:r>
           <w:rPr>
             <w:rStyle w:val="Hyperlnk"/>
@@ -3546,7 +3546,7 @@
             <w:noProof/>
             <w:webHidden/>
           </w:rPr>
-          <w:instrText xml:space="preserve"> PAGEREF _Toc230779727 \h </w:instrText>
+          <w:instrText xml:space="preserve"> PAGEREF _Toc230783549 \h </w:instrText>
         </w:r>
         <w:r>
           <w:rPr>
@@ -3590,7 +3590,7 @@
           <w14:ligatures w14:val="standardContextual"/>
         </w:rPr>
       </w:pPr>
-      <w:hyperlink w:anchor="_Toc230779728" w:history="1">
+      <w:hyperlink w:anchor="_Toc230783550" w:history="1">
         <w:r>
           <w:rPr>
             <w:rStyle w:val="Hyperlnk"/>
@@ -3636,7 +3636,7 @@
             <w:noProof/>
             <w:webHidden/>
           </w:rPr>
-          <w:instrText xml:space="preserve"> PAGEREF _Toc230779728 \h </w:instrText>
+          <w:instrText xml:space="preserve"> PAGEREF _Toc230783550 \h </w:instrText>
         </w:r>
         <w:r>
           <w:rPr>
@@ -3680,7 +3680,7 @@
           <w14:ligatures w14:val="standardContextual"/>
         </w:rPr>
       </w:pPr>
-      <w:hyperlink w:anchor="_Toc230779729" w:history="1">
+      <w:hyperlink w:anchor="_Toc230783551" w:history="1">
         <w:r>
           <w:rPr>
             <w:rStyle w:val="Hyperlnk"/>
@@ -3726,7 +3726,7 @@
             <w:noProof/>
             <w:webHidden/>
           </w:rPr>
-          <w:instrText xml:space="preserve"> PAGEREF _Toc230779729 \h </w:instrText>
+          <w:instrText xml:space="preserve"> PAGEREF _Toc230783551 \h </w:instrText>
         </w:r>
         <w:r>
           <w:rPr>
@@ -3770,7 +3770,7 @@
           <w14:ligatures w14:val="standardContextual"/>
         </w:rPr>
       </w:pPr>
-      <w:hyperlink w:anchor="_Toc230779730" w:history="1">
+      <w:hyperlink w:anchor="_Toc230783552" w:history="1">
         <w:r>
           <w:rPr>
             <w:rStyle w:val="Hyperlnk"/>
@@ -3816,7 +3816,7 @@
             <w:noProof/>
             <w:webHidden/>
           </w:rPr>
-          <w:instrText xml:space="preserve"> PAGEREF _Toc230779730 \h </w:instrText>
+          <w:instrText xml:space="preserve"> PAGEREF _Toc230783552 \h </w:instrText>
         </w:r>
         <w:r>
           <w:rPr>
@@ -3877,7 +3877,7 @@
       <w:pPr>
         <w:pStyle w:val="Rubrik1"/>
       </w:pPr>
-      <w:bookmarkStart w:id="1" w:name="_Toc230779714"/>
+      <w:bookmarkStart w:id="1" w:name="_Toc230783536"/>
       <w:r>
         <w:lastRenderedPageBreak/>
         <w:t>Inledning</w:t>
@@ -3908,7 +3908,7 @@
       <w:pPr>
         <w:pStyle w:val="Rubrik1"/>
       </w:pPr>
-      <w:bookmarkStart w:id="2" w:name="_Toc230779715"/>
+      <w:bookmarkStart w:id="2" w:name="_Toc230783537"/>
       <w:r>
         <w:t>Installation</w:t>
       </w:r>
@@ -3953,7 +3953,7 @@
       <w:pPr>
         <w:pStyle w:val="Rubrik1"/>
       </w:pPr>
-      <w:bookmarkStart w:id="3" w:name="_Toc230779716"/>
+      <w:bookmarkStart w:id="3" w:name="_Toc230783538"/>
       <w:r>
         <w:t>Exempel på konfigurering av stödmiljöer för Origo Globe Plugin</w:t>
       </w:r>
@@ -3982,7 +3982,7 @@
       <w:pPr>
         <w:pStyle w:val="Rubrik2"/>
       </w:pPr>
-      <w:bookmarkStart w:id="4" w:name="_Toc230779717"/>
+      <w:bookmarkStart w:id="4" w:name="_Toc230783539"/>
       <w:r>
         <w:t>Geoserver</w:t>
       </w:r>
@@ -3992,7 +3992,7 @@
       <w:pPr>
         <w:pStyle w:val="Rubrik3"/>
       </w:pPr>
-      <w:bookmarkStart w:id="5" w:name="_Toc230779718"/>
+      <w:bookmarkStart w:id="5" w:name="_Toc230783540"/>
       <w:r>
         <w:t>Konfigurering av WMS för optimal prestanda</w:t>
       </w:r>
@@ -4013,7 +4013,7 @@
       <w:pPr>
         <w:pStyle w:val="Rubrik3"/>
       </w:pPr>
-      <w:bookmarkStart w:id="6" w:name="_Toc230779719"/>
+      <w:bookmarkStart w:id="6" w:name="_Toc230783541"/>
       <w:r>
         <w:t>Uppsättning av WFS för dynamisk byggnadsvolymshantering i Origo Globe</w:t>
       </w:r>
@@ -4078,7 +4078,7 @@
       <w:pPr>
         <w:pStyle w:val="Rubrik3"/>
       </w:pPr>
-      <w:bookmarkStart w:id="7" w:name="_Toc230779720"/>
+      <w:bookmarkStart w:id="7" w:name="_Toc230783542"/>
       <w:r>
         <w:t xml:space="preserve">Uppsättning av WFS för </w:t>
       </w:r>
@@ -4135,7 +4135,7 @@
       <w:pPr>
         <w:pStyle w:val="Rubrik3"/>
       </w:pPr>
-      <w:bookmarkStart w:id="8" w:name="_Toc230779721"/>
+      <w:bookmarkStart w:id="8" w:name="_Toc230783543"/>
       <w:r>
         <w:t>Uppsättning för visualisering av IFC-modeller</w:t>
       </w:r>
@@ -4176,7 +4176,7 @@
       <w:pPr>
         <w:pStyle w:val="Rubrik2"/>
       </w:pPr>
-      <w:bookmarkStart w:id="9" w:name="_Toc230779722"/>
+      <w:bookmarkStart w:id="9" w:name="_Toc230783544"/>
       <w:r>
         <w:t>3DCityDB</w:t>
       </w:r>
@@ -4196,7 +4196,7 @@
       <w:pPr>
         <w:pStyle w:val="Rubrik3"/>
       </w:pPr>
-      <w:bookmarkStart w:id="10" w:name="_Toc230779723"/>
+      <w:bookmarkStart w:id="10" w:name="_Toc230783545"/>
       <w:r>
         <w:t>PG2B3DM</w:t>
       </w:r>
@@ -4220,7 +4220,7 @@
       <w:pPr>
         <w:pStyle w:val="Rubrik2"/>
       </w:pPr>
-      <w:bookmarkStart w:id="11" w:name="_Toc230779724"/>
+      <w:bookmarkStart w:id="11" w:name="_Toc230783546"/>
       <w:r>
         <w:t>3D-</w:t>
       </w:r>
@@ -4233,7 +4233,7 @@
       <w:pPr>
         <w:pStyle w:val="Rubrik3"/>
       </w:pPr>
-      <w:bookmarkStart w:id="12" w:name="_Toc230779725"/>
+      <w:bookmarkStart w:id="12" w:name="_Toc230783547"/>
       <w:r>
         <w:t xml:space="preserve">3D-tak till </w:t>
       </w:r>
@@ -4244,14 +4244,26 @@
     </w:p>
     <w:p>
       <w:r>
-        <w:t>FME-skript användes för att ta fram cityJSON format av byggnaderna baserade på 3D-tak.</w:t>
+        <w:t>FME-skript</w:t>
+      </w:r>
+      <w:r>
+        <w:t xml:space="preserve">et </w:t>
+      </w:r>
+      <w:r>
+        <w:t>roofs2models.fmw</w:t>
+      </w:r>
+      <w:r>
+        <w:t xml:space="preserve"> användes </w:t>
+      </w:r>
+      <w:r>
+        <w:t>för att ta fram cityJSON format av byggnaderna baserade på 3D-tak.</w:t>
       </w:r>
     </w:p>
     <w:p>
       <w:pPr>
         <w:pStyle w:val="Rubrik3"/>
       </w:pPr>
-      <w:bookmarkStart w:id="13" w:name="_Toc230779726"/>
+      <w:bookmarkStart w:id="13" w:name="_Toc230783548"/>
       <w:r>
         <w:t>3DCityDB</w:t>
       </w:r>
@@ -4300,7 +4312,7 @@
       <w:pPr>
         <w:pStyle w:val="Rubrik3"/>
       </w:pPr>
-      <w:bookmarkStart w:id="14" w:name="_Toc230779727"/>
+      <w:bookmarkStart w:id="14" w:name="_Toc230783549"/>
       <w:r>
         <w:lastRenderedPageBreak/>
         <w:t>PG2B3DM</w:t>
@@ -4394,7 +4406,7 @@
       <w:pPr>
         <w:pStyle w:val="Rubrik2"/>
       </w:pPr>
-      <w:bookmarkStart w:id="15" w:name="_Toc230779728"/>
+      <w:bookmarkStart w:id="15" w:name="_Toc230783550"/>
       <w:r>
         <w:t>Markmodell i quantized mesh</w:t>
       </w:r>
@@ -4412,7 +4424,7 @@
       <w:pPr>
         <w:pStyle w:val="Rubrik3"/>
       </w:pPr>
-      <w:bookmarkStart w:id="16" w:name="_Toc230779729"/>
+      <w:bookmarkStart w:id="16" w:name="_Toc230783551"/>
       <w:r>
         <w:t>Punktmolnsbearbetning</w:t>
       </w:r>
@@ -4420,14 +4432,51 @@
     </w:p>
     <w:p>
       <w:r>
-        <w:t xml:space="preserve">FME script utvecklades där höjddata i GEOTIFF format transformerades om till punktmoln. </w:t>
+        <w:t>FME</w:t>
+      </w:r>
+      <w:r>
+        <w:t xml:space="preserve">-skript </w:t>
+      </w:r>
+      <w:r>
+        <w:t xml:space="preserve">användes för att transformera </w:t>
+      </w:r>
+      <w:r>
+        <w:t xml:space="preserve">höjddata i </w:t>
+      </w:r>
+      <w:r>
+        <w:t>ASCII</w:t>
+      </w:r>
+      <w:r>
+        <w:t xml:space="preserve"> format </w:t>
+      </w:r>
+      <w:r>
+        <w:t>punktmoln</w:t>
+      </w:r>
+      <w:r>
+        <w:t>(las)</w:t>
+      </w:r>
+      <w:r>
+        <w:t xml:space="preserve">. </w:t>
+      </w:r>
+      <w:r>
+        <w:br/>
+        <w:t xml:space="preserve"> 1. </w:t>
+      </w:r>
+      <w:r>
+        <w:t>ASCII2GEOTIFF.fmw</w:t>
+      </w:r>
+      <w:r>
+        <w:t xml:space="preserve"> -&gt; </w:t>
+      </w:r>
+      <w:r>
+        <w:t>geotiff2las.fmw</w:t>
       </w:r>
     </w:p>
     <w:p>
       <w:pPr>
         <w:pStyle w:val="Rubrik3"/>
       </w:pPr>
-      <w:bookmarkStart w:id="17" w:name="_Toc230779730"/>
+      <w:bookmarkStart w:id="17" w:name="_Toc230783552"/>
       <w:r>
         <w:t>Mago3DTerrainer</w:t>
       </w:r>
@@ -35287,8 +35336,10 @@
     <w:rsidRoot w:val="006E1C80"/>
     <w:rsid w:val="006E1C80"/>
     <w:rsid w:val="00B04A99"/>
+    <w:rsid w:val="00B27D7B"/>
     <w:rsid w:val="00C7195D"/>
     <w:rsid w:val="00E21AC6"/>
+    <w:rsid w:val="00F22C23"/>
   </w:rsids>
   <m:mathPr>
     <m:mathFont m:val="Cambria Math"/>
@@ -35991,7 +36042,11 @@
 </file>
 
 <file path=customXml/item1.xml><?xml version="1.0" encoding="utf-8"?>
-<Sources xmlns:b="http://schemas.openxmlformats.org/officeDocument/2006/bibliography" xmlns="http://schemas.openxmlformats.org/officeDocument/2006/bibliography" SelectedStyle="\APASixthEditionOfficeOnline.xsl" StyleName="APA" Version="6"/>
+<FormTemplates xmlns="http://schemas.microsoft.com/sharepoint/v3/contenttype/forms">
+  <Display>DocumentLibraryForm</Display>
+  <Edit>DocumentLibraryForm</Edit>
+  <New>DocumentLibraryForm</New>
+</FormTemplates>
 </file>
 
 <file path=customXml/item2.xml><?xml version="1.0" encoding="utf-8"?>
@@ -35999,15 +36054,18 @@
 </file>
 
 <file path=customXml/item3.xml><?xml version="1.0" encoding="utf-8"?>
-<TemplafyTextElementConfigurations xmlns:xsi="http://www.w3.org/2001/XMLSchema-instance" xmlns:xsd="http://www.w3.org/2001/XMLSchema">
-  <TextElement ElementMetadataLinkId="dbee4ff0-5fdf-4452-8fed-61f84e570a60" TemplateId="637836304274572432">
-    <TemplateConfiguration>{"elementsMetadata":[{"elementConfiguration":{"binding":"{{Translate(\"swLead_changelist\")}}","removeAndKeepContent":false,"disableUpdates":false,"type":"text"},"type":"richTextContentControl","id":"e2612632-f65a-4be9-a02d-e92203134553"},{"elementConfiguration":{"binding":"{{Translate(\"swLead_version\")}}","removeAndKeepContent":false,"disableUpdates":false,"type":"text"},"type":"richTextContentControl","id":"48f04f06-6045-445a-9a5e-62f816ba4bc0"},{"elementConfiguration":{"binding":"{{Translate(\"swLead_Date\")}}","removeAndKeepContent":false,"disableUpdates":false,"type":"text"},"type":"richTextContentControl","id":"0dd118e2-5f1b-4dd3-80ae-5e45854bcf20"},{"elementConfiguration":{"binding":"{{Translate(\"swLead_Descriptionchange\")}}","removeAndKeepContent":false,"disableUpdates":false,"type":"text"},"type":"richTextContentControl","id":"97593bac-5010-4ab2-ba0e-680d560fc8e5"},{"elementConfiguration":{"binding":"{{Translate(\"swLead_Reviewed\")}}","removeAndKeepContent":false,"disableUpdates":false,"type":"text"},"type":"richTextContentControl","id":"afa80ee8-d6cc-40de-8f8d-ee2dff5a78b1"},{"elementConfiguration":{"binding":"{{Translate(\"swLead_Approved\")}}","removeAndKeepContent":false,"disableUpdates":false,"type":"text"},"type":"richTextContentControl","id":"9c8600b2-795e-45ed-a4ae-4692b9da8589"}],"transformationConfigurations":[],"enableDocumentContentUpdater":false,"version":"2.0"}</TemplateConfiguration>
-    <FormConfiguration>{"formFields":[],"formDataEntries":[]}</FormConfiguration>
-  </TextElement>
-</TemplafyTextElementConfigurations>
+<Sources xmlns:b="http://schemas.openxmlformats.org/officeDocument/2006/bibliography" xmlns="http://schemas.openxmlformats.org/officeDocument/2006/bibliography" SelectedStyle="\APASixthEditionOfficeOnline.xsl" StyleName="APA" Version="6"/>
 </file>
 
 <file path=customXml/item4.xml><?xml version="1.0" encoding="utf-8"?>
+<AccessibilityAssistantData><![CDATA[{"Data":{}}]]></AccessibilityAssistantData>
+</file>
+
+<file path=customXml/item5.xml><?xml version="1.0" encoding="utf-8"?>
+<TemplafyTemplateConfiguration><![CDATA[{"elementsMetadata":[{"elementConfiguration":{"binding":"{{Translate(\"swLead_title\")}}","visibility":"","removeAndKeepContent":false,"disableUpdates":false,"type":"text"},"type":"richTextContentControl","id":"4856755a-898a-47e6-9fe7-214ee4758dab"},{"elementConfiguration":{"binding":"{{Translate(\"swLead_SubTitle\")}}","visibility":"","removeAndKeepContent":false,"disableUpdates":false,"type":"text"},"type":"richTextContentControl","id":"1453a8ad-05c3-42b1-8f9d-7ba07202c2e3"},{"elementConfiguration":{"assetId":"{{Form.ListofChanges.ListofChangesReportInsertRef.AssetID}}","visibility":"","textElementPlaceholderName":"TextElement1","replaceOnUpdate":false,"type":"textElement"},"type":"richTextContentControl","id":"dbee4ff0-5fdf-4452-8fed-61f84e570a60"},{"elementConfiguration":{"binding":"{{UserProfile.Company.CompanyName}}","removeAndKeepContent":false,"disableUpdates":false,"type":"text"},"type":"richTextContentControl","id":"919c6b4e-e7aa-4cc9-951b-c7a49b1a780f"},{"elementConfiguration":{"visibility":"{{IfElse(Equals(UserProfile.Company.OrganizationNo,\"\"), VisibilityType.Hidden, VisibilityType.Visible)}}","disableUpdates":true,"type":"group"},"type":"richTextContentControl","id":"5f7e7909-6791-47a1-bced-67daaaa0d6bf"},{"elementConfiguration":{"binding":"{{Translate(\"swLead_RegNo\")}}","removeAndKeepContent":false,"disableUpdates":false,"type":"text"},"type":"richTextContentControl","id":"d705a677-fbdf-4930-99ba-7efc99664e2a"},{"elementConfiguration":{"binding":"{{UserProfile.Company.OrganizationNo}}","visibility":"","removeAndKeepContent":false,"disableUpdates":false,"type":"text"},"type":"richTextContentControl","id":"7459be39-ad57-46aa-8755-7ca4949f8820"},{"elementConfiguration":{"binding":"{{Translate(\"swLead_ProjName\")}}","removeAndKeepContent":false,"disableUpdates":false,"type":"text"},"type":"richTextContentControl","id":"a9071535-bdb0-4532-a4f8-f4dfc47057ac"},{"elementConfiguration":{"binding":"{{Translate(\"swLead_ProjNo\")}}","removeAndKeepContent":false,"disableUpdates":false,"type":"text"},"type":"richTextContentControl","id":"0a43358a-5b56-4740-80d7-1d2ff309c8c6"},{"elementConfiguration":{"binding":"{{Translate(\"swLead_CustName\")}}","removeAndKeepContent":false,"disableUpdates":false,"type":"text"},"type":"richTextContentControl","id":"30b8a6bd-0a9a-47aa-be94-4919b9ae85ad"},{"elementConfiguration":{"visibility":"{{IfElse(Equals(Form.Author,\"\"), VisibilityType.Hidden, VisibilityType.Visible)}}","disableUpdates":false,"type":"group"},"type":"richTextContentControl","id":"865ab4a1-0446-4ea8-bfec-300b027e9853"},{"elementConfiguration":{"binding":"{{Translate(\"swLead_Author\")}}","removeAndKeepContent":false,"disableUpdates":false,"type":"text"},"type":"richTextContentControl","id":"3ae670c1-f5a4-406c-b561-3ca753edea80"},{"elementConfiguration":{"visibility":"{{IfElse(Equals(Form.ControlledBy,\"\"), VisibilityType.Hidden, VisibilityType.Visible)}}","disableUpdates":false,"type":"group"},"type":"richTextContentControl","id":"c4ed1abb-e94a-42ad-91e0-620087e06ece"},{"elementConfiguration":{"binding":"{{Translate(\"swLead_ControlledBy\")}}","removeAndKeepContent":false,"disableUpdates":false,"type":"text"},"type":"richTextContentControl","id":"a6299875-d5ed-43a3-bc1b-78935e948492"},{"elementConfiguration":{"visibility":"{{IfElse(Equals(Form.ApprovedBy,\"\"), VisibilityType.Hidden, VisibilityType.Visible)}}","disableUpdates":false,"type":"group"},"type":"richTextContentControl","id":"7cc7ab0f-ac89-4c9d-ba63-363ebb3d755e"},{"elementConfiguration":{"binding":"{{Translate(\"swLead_Approved\")}}","removeAndKeepContent":false,"disableUpdates":false,"type":"text"},"type":"richTextContentControl","id":"96161be7-8919-49fe-b1db-5fd4f78e36d3"},{"elementConfiguration":{"binding":"{{Translate(\"swLead_Date\")}}","removeAndKeepContent":false,"disableUpdates":false,"type":"text"},"type":"richTextContentControl","id":"6a8dfaec-c786-49ba-884a-75ce9ef68760"},{"elementConfiguration":{"visibility":"{{IfElse(Equals(Form.VersionNo,\"\"), VisibilityType.Hidden, VisibilityType.Visible)}}","disableUpdates":false,"type":"group"},"type":"richTextContentControl","id":"3414b447-44f8-4e67-a447-8663c0b6006b"},{"elementConfiguration":{"binding":"{{Translate(\"swLead_version\")}}","removeAndKeepContent":false,"disableUpdates":false,"type":"text"},"type":"richTextContentControl","id":"ee522ea3-6bb7-4969-8af9-03322527e43e"},{"elementConfiguration":{"visibility":"{{IfElse(Equals(Form.DocNo,\"\"), VisibilityType.Hidden, VisibilityType.Visible)}}","disableUpdates":false,"type":"group"},"type":"richTextContentControl","id":"17a0ad29-03fd-4bcd-ae19-11cb14e54259"},{"elementConfiguration":{"binding":"{{Translate(\"swLead_DocNo\")}}","removeAndKeepContent":false,"disableUpdates":false,"type":"text"},"type":"richTextContentControl","id":"68fad542-6e9e-4aa2-b087-0f81cc984b5b"},{"elementConfiguration":{"binding":"{{Translate(\"swLead_DocRef\")}}","removeAndKeepContent":false,"disableUpdates":false,"type":"text"},"type":"richTextContentControl","id":"9882f56e-c863-4574-a9de-9257bdc2a104"},{"elementConfiguration":{"binding":"{{Translate(\"swLead_TOC\")}}","removeAndKeepContent":false,"disableUpdates":false,"type":"text"},"type":"richTextContentControl","id":"89b7ad24-2478-4df2-91f7-4901e2e787dd"},{"elementConfiguration":{"binding":"{{Translate(\"swLead_Appendix\")}}","visibility":"","removeAndKeepContent":false,"disableUpdates":false,"type":"text"},"type":"richTextContentControl","id":"60b6be7c-5e6f-4249-92e5-3eacf34f30a5"},{"elementConfiguration":{"binding":"{{Translate(\"swLead_ProjNo\")}}","removeAndKeepContent":false,"disableUpdates":false,"type":"text"},"type":"richTextContentControl","id":"82050715-0e37-4597-9822-c7460da6c72a"},{"elementConfiguration":{"binding":"{{Translate(\"swLead_Date\")}}","removeAndKeepContent":false,"disableUpdates":false,"type":"text"},"type":"richTextContentControl","id":"5343b8b6-a339-4919-b4f3-64e3c99673ce"},{"elementConfiguration":{"binding":"{{Translate(\"swLead_version\")}}","removeAndKeepContent":false,"disableUpdates":false,"type":"text"},"type":"richTextContentControl","id":"1a4738da-cfd1-49da-a819-aa2f6fe293ae"},{"elementConfiguration":{"binding":"{{Translate(\"swLead_DocRef\")}}","removeAndKeepContent":false,"disableUpdates":false,"type":"text"},"type":"richTextContentControl","id":"c9732396-6fca-4b77-be66-16f4dbf1df93"}],"transformationConfigurations":[{"image":"{{DataSources.LogoInsertion[\"Sweco\"].ImageFileRef.Image}}","shapeName":"LogoFrontpageHide","width":"{{DataSources.LogoInsertion[\"Sweco\"].LogoWidth}}","height":"","namedSections":"{{NamedSections.First}}","namedPages":"{{NamedPages.All}}","numberedSections":[],"leftOffset":"{{DataSources.LogoInsertion[\"Sweco\"].LogoLeftOffset}}","horizontalRelativePosition":"{{HorizontalRelativePosition.Page}}","horizontalAlignment":"","topOffset":"27.69 cm","verticalRelativePosition":"{{VerticalRelativePosition.Page}}","verticalAlignment":"","imageTextWrapping":"{{ImageTextWrapping.InFrontOfText}}","rotation":"","color":"","disableUpdates":false,"type":"imageHeader"},{"language":"{{DocumentLanguage}}","disableUpdates":false,"type":"proofingLanguage"},{"image":"{{DataSources.LogoInsertion[\"Sweco\"].ImageFileRef.Image}}","shapeName":"LogoHide","width":"{{DataSources.LogoInsertion[\"Sweco\"].LogoWidth}}","height":"","namedSections":"{{NamedSections.All}}","namedPages":"{{NamedPages.All}}","numberedSections":[],"leftOffset":"{{DataSources.LogoInsertion[\"Sweco\"].LogoLeftOffset}}","horizontalRelativePosition":"{{HorizontalRelativePosition.Page}}","horizontalAlignment":"{{HorizontalAlignment.Right}}","topOffset":"{{DataSources.LogoInsertion[\"Sweco\"].LogoTopOffset}}","verticalRelativePosition":"{{VerticalRelativePosition.Page}}","verticalAlignment":"","imageTextWrapping":"{{ImageTextWrapping.BehindText}}","rotation":"","color":"","disableUpdates":true,"type":"imageHeader"},{"propertyName":"swAttribute_Date_created","propertyValue":"{{FormatDateTime(Form.Date, Translate(\"DateFormatGeneral\"), DocumentLanguage)}}","disableUpdates":false,"type":"customDocumentProperty"},{"propertyName":"swAttribute_Version","propertyValue":"{{Form.VersionNo}}","disableUpdates":false,"type":"customDocumentProperty"},{"propertyName":"swAttribute_Document_number","propertyValue":"{{Form.DocNo}}","disableUpdates":false,"type":"customDocumentProperty"},{"propertyName":"swAttribute_Author","propertyValue":"{{Form.Author}}","disableUpdates":false,"type":"customDocumentProperty"},{"propertyName":"swAttribute_Controlled","propertyValue":"{{Form.ControlledBy}}","disableUpdates":false,"type":"customDocumentProperty"},{"propertyName":"swAttribute_Approved","propertyValue":"{{Form.ApprovedBy}}","disableUpdates":false,"type":"customDocumentProperty"},{"colorTheme":"{{DataSources.ColorThemes[\"Sweco\"].ColorTheme}}","disableUpdates":false,"originalColorThemeXml":"<a:clrScheme name=\"Sweco 2022\" xmlns:a=\"http://schemas.openxmlformats.org/drawingml/2006/main\"><a:dk1><a:srgbClr val=\"000000\" /></a:dk1><a:lt1><a:srgbClr val=\"FFFFFF\" /></a:lt1><a:dk2><a:srgbClr val=\"3F3F42\" /></a:dk2><a:lt2><a:srgbClr val=\"E2E0DA\" /></a:lt2><a:accent1><a:srgbClr val=\"A4A4A6\" /></a:accent1><a:accent2><a:srgbClr val=\"DEC55B\" /></a:accent2><a:accent3><a:srgbClr val=\"9DD354\" /></a:accent3><a:accent4><a:srgbClr val=\"C0D4FD\" /></a:accent4><a:accent5><a:srgbClr val=\"7A9B62\" /></a:accent5><a:accent6><a:srgbClr val=\"3F3F42\" /></a:accent6><a:hlink><a:srgbClr val=\"C0D4FD\" /></a:hlink><a:folHlink><a:srgbClr val=\"9DD354\" /></a:folHlink></a:clrScheme>","type":"colorTheme"},{"propertyName":"swAttribute_Date_updated","propertyValue":"","disableUpdates":false,"type":"customDocumentProperty"},{"propertyName":"swAttribute_Client_contact","propertyValue":"","disableUpdates":false,"type":"customDocumentProperty"},{"propertyName":"swAttribute_Document_description","propertyValue":"","disableUpdates":false,"type":"customDocumentProperty"},{"propertyName":"swAttribute_Document_status","propertyValue":"","disableUpdates":false,"type":"customDocumentProperty"},{"propertyName":"swAttribute_Project_phase","propertyValue":"","disableUpdates":false,"type":"customDocumentProperty"}],"templateName":"Report light","templateDescription":"Less designed standard Sweco report: with project info, logo -Portrait","enableDocumentContentUpdater":true,"version":"2.0"}]]></TemplafyTemplateConfiguration>
+</file>
+
+<file path=customXml/item6.xml><?xml version="1.0" encoding="utf-8"?>
 <ct:contentTypeSchema xmlns:ct="http://schemas.microsoft.com/office/2006/metadata/contentType" xmlns:ma="http://schemas.microsoft.com/office/2006/metadata/properties/metaAttributes" ct:_="" ma:_="" ma:contentTypeName="dokument" ma:contentTypeID="0x010100173C1F433BAA0A44B4D2FCB175CB4863" ma:contentTypeVersion="4" ma:contentTypeDescription="Skapa ett nytt dokument." ma:contentTypeScope="" ma:versionID="ed63118f8de4e670421b0c8045b11496">
   <xs:schema xmlns:xsd="http://www.w3.org/2001/XMLSchema" xmlns:xs="http://www.w3.org/2001/XMLSchema" xmlns:p="http://schemas.microsoft.com/office/2006/metadata/properties" xmlns:ns2="a77011b1-2852-4ba0-b4f7-769f79c42d56" xmlns:ns3="3e02348f-a843-4f6a-80e9-20f7c20a9898" targetNamespace="http://schemas.microsoft.com/office/2006/metadata/properties" ma:root="true" ma:fieldsID="7d6cc6f549f3e6620978f08b171f77e2" ns2:_="" ns3:_="">
     <xs:import namespace="a77011b1-2852-4ba0-b4f7-769f79c42d56"/>
@@ -36172,26 +36230,19 @@
 </ct:contentTypeSchema>
 </file>
 
-<file path=customXml/item5.xml><?xml version="1.0" encoding="utf-8"?>
-<TemplafyTemplateConfiguration><![CDATA[{"elementsMetadata":[{"elementConfiguration":{"binding":"{{Translate(\"swLead_title\")}}","visibility":"","removeAndKeepContent":false,"disableUpdates":false,"type":"text"},"type":"richTextContentControl","id":"4856755a-898a-47e6-9fe7-214ee4758dab"},{"elementConfiguration":{"binding":"{{Translate(\"swLead_SubTitle\")}}","visibility":"","removeAndKeepContent":false,"disableUpdates":false,"type":"text"},"type":"richTextContentControl","id":"1453a8ad-05c3-42b1-8f9d-7ba07202c2e3"},{"elementConfiguration":{"assetId":"{{Form.ListofChanges.ListofChangesReportInsertRef.AssetID}}","visibility":"","textElementPlaceholderName":"TextElement1","replaceOnUpdate":false,"type":"textElement"},"type":"richTextContentControl","id":"dbee4ff0-5fdf-4452-8fed-61f84e570a60"},{"elementConfiguration":{"binding":"{{UserProfile.Company.CompanyName}}","removeAndKeepContent":false,"disableUpdates":false,"type":"text"},"type":"richTextContentControl","id":"919c6b4e-e7aa-4cc9-951b-c7a49b1a780f"},{"elementConfiguration":{"visibility":"{{IfElse(Equals(UserProfile.Company.OrganizationNo,\"\"), VisibilityType.Hidden, VisibilityType.Visible)}}","disableUpdates":true,"type":"group"},"type":"richTextContentControl","id":"5f7e7909-6791-47a1-bced-67daaaa0d6bf"},{"elementConfiguration":{"binding":"{{Translate(\"swLead_RegNo\")}}","removeAndKeepContent":false,"disableUpdates":false,"type":"text"},"type":"richTextContentControl","id":"d705a677-fbdf-4930-99ba-7efc99664e2a"},{"elementConfiguration":{"binding":"{{UserProfile.Company.OrganizationNo}}","visibility":"","removeAndKeepContent":false,"disableUpdates":false,"type":"text"},"type":"richTextContentControl","id":"7459be39-ad57-46aa-8755-7ca4949f8820"},{"elementConfiguration":{"binding":"{{Translate(\"swLead_ProjName\")}}","removeAndKeepContent":false,"disableUpdates":false,"type":"text"},"type":"richTextContentControl","id":"a9071535-bdb0-4532-a4f8-f4dfc47057ac"},{"elementConfiguration":{"binding":"{{Translate(\"swLead_ProjNo\")}}","removeAndKeepContent":false,"disableUpdates":false,"type":"text"},"type":"richTextContentControl","id":"0a43358a-5b56-4740-80d7-1d2ff309c8c6"},{"elementConfiguration":{"binding":"{{Translate(\"swLead_CustName\")}}","removeAndKeepContent":false,"disableUpdates":false,"type":"text"},"type":"richTextContentControl","id":"30b8a6bd-0a9a-47aa-be94-4919b9ae85ad"},{"elementConfiguration":{"visibility":"{{IfElse(Equals(Form.Author,\"\"), VisibilityType.Hidden, VisibilityType.Visible)}}","disableUpdates":false,"type":"group"},"type":"richTextContentControl","id":"865ab4a1-0446-4ea8-bfec-300b027e9853"},{"elementConfiguration":{"binding":"{{Translate(\"swLead_Author\")}}","removeAndKeepContent":false,"disableUpdates":false,"type":"text"},"type":"richTextContentControl","id":"3ae670c1-f5a4-406c-b561-3ca753edea80"},{"elementConfiguration":{"visibility":"{{IfElse(Equals(Form.ControlledBy,\"\"), VisibilityType.Hidden, VisibilityType.Visible)}}","disableUpdates":false,"type":"group"},"type":"richTextContentControl","id":"c4ed1abb-e94a-42ad-91e0-620087e06ece"},{"elementConfiguration":{"binding":"{{Translate(\"swLead_ControlledBy\")}}","removeAndKeepContent":false,"disableUpdates":false,"type":"text"},"type":"richTextContentControl","id":"a6299875-d5ed-43a3-bc1b-78935e948492"},{"elementConfiguration":{"visibility":"{{IfElse(Equals(Form.ApprovedBy,\"\"), VisibilityType.Hidden, VisibilityType.Visible)}}","disableUpdates":false,"type":"group"},"type":"richTextContentControl","id":"7cc7ab0f-ac89-4c9d-ba63-363ebb3d755e"},{"elementConfiguration":{"binding":"{{Translate(\"swLead_Approved\")}}","removeAndKeepContent":false,"disableUpdates":false,"type":"text"},"type":"richTextContentControl","id":"96161be7-8919-49fe-b1db-5fd4f78e36d3"},{"elementConfiguration":{"binding":"{{Translate(\"swLead_Date\")}}","removeAndKeepContent":false,"disableUpdates":false,"type":"text"},"type":"richTextContentControl","id":"6a8dfaec-c786-49ba-884a-75ce9ef68760"},{"elementConfiguration":{"visibility":"{{IfElse(Equals(Form.VersionNo,\"\"), VisibilityType.Hidden, VisibilityType.Visible)}}","disableUpdates":false,"type":"group"},"type":"richTextContentControl","id":"3414b447-44f8-4e67-a447-8663c0b6006b"},{"elementConfiguration":{"binding":"{{Translate(\"swLead_version\")}}","removeAndKeepContent":false,"disableUpdates":false,"type":"text"},"type":"richTextContentControl","id":"ee522ea3-6bb7-4969-8af9-03322527e43e"},{"elementConfiguration":{"visibility":"{{IfElse(Equals(Form.DocNo,\"\"), VisibilityType.Hidden, VisibilityType.Visible)}}","disableUpdates":false,"type":"group"},"type":"richTextContentControl","id":"17a0ad29-03fd-4bcd-ae19-11cb14e54259"},{"elementConfiguration":{"binding":"{{Translate(\"swLead_DocNo\")}}","removeAndKeepContent":false,"disableUpdates":false,"type":"text"},"type":"richTextContentControl","id":"68fad542-6e9e-4aa2-b087-0f81cc984b5b"},{"elementConfiguration":{"binding":"{{Translate(\"swLead_DocRef\")}}","removeAndKeepContent":false,"disableUpdates":false,"type":"text"},"type":"richTextContentControl","id":"9882f56e-c863-4574-a9de-9257bdc2a104"},{"elementConfiguration":{"binding":"{{Translate(\"swLead_TOC\")}}","removeAndKeepContent":false,"disableUpdates":false,"type":"text"},"type":"richTextContentControl","id":"89b7ad24-2478-4df2-91f7-4901e2e787dd"},{"elementConfiguration":{"binding":"{{Translate(\"swLead_Appendix\")}}","visibility":"","removeAndKeepContent":false,"disableUpdates":false,"type":"text"},"type":"richTextContentControl","id":"60b6be7c-5e6f-4249-92e5-3eacf34f30a5"},{"elementConfiguration":{"binding":"{{Translate(\"swLead_ProjNo\")}}","removeAndKeepContent":false,"disableUpdates":false,"type":"text"},"type":"richTextContentControl","id":"82050715-0e37-4597-9822-c7460da6c72a"},{"elementConfiguration":{"binding":"{{Translate(\"swLead_Date\")}}","removeAndKeepContent":false,"disableUpdates":false,"type":"text"},"type":"richTextContentControl","id":"5343b8b6-a339-4919-b4f3-64e3c99673ce"},{"elementConfiguration":{"binding":"{{Translate(\"swLead_version\")}}","removeAndKeepContent":false,"disableUpdates":false,"type":"text"},"type":"richTextContentControl","id":"1a4738da-cfd1-49da-a819-aa2f6fe293ae"},{"elementConfiguration":{"binding":"{{Translate(\"swLead_DocRef\")}}","removeAndKeepContent":false,"disableUpdates":false,"type":"text"},"type":"richTextContentControl","id":"c9732396-6fca-4b77-be66-16f4dbf1df93"}],"transformationConfigurations":[{"image":"{{DataSources.LogoInsertion[\"Sweco\"].ImageFileRef.Image}}","shapeName":"LogoFrontpageHide","width":"{{DataSources.LogoInsertion[\"Sweco\"].LogoWidth}}","height":"","namedSections":"{{NamedSections.First}}","namedPages":"{{NamedPages.All}}","numberedSections":[],"leftOffset":"{{DataSources.LogoInsertion[\"Sweco\"].LogoLeftOffset}}","horizontalRelativePosition":"{{HorizontalRelativePosition.Page}}","horizontalAlignment":"","topOffset":"27.69 cm","verticalRelativePosition":"{{VerticalRelativePosition.Page}}","verticalAlignment":"","imageTextWrapping":"{{ImageTextWrapping.InFrontOfText}}","rotation":"","color":"","disableUpdates":false,"type":"imageHeader"},{"language":"{{DocumentLanguage}}","disableUpdates":false,"type":"proofingLanguage"},{"image":"{{DataSources.LogoInsertion[\"Sweco\"].ImageFileRef.Image}}","shapeName":"LogoHide","width":"{{DataSources.LogoInsertion[\"Sweco\"].LogoWidth}}","height":"","namedSections":"{{NamedSections.All}}","namedPages":"{{NamedPages.All}}","numberedSections":[],"leftOffset":"{{DataSources.LogoInsertion[\"Sweco\"].LogoLeftOffset}}","horizontalRelativePosition":"{{HorizontalRelativePosition.Page}}","horizontalAlignment":"{{HorizontalAlignment.Right}}","topOffset":"{{DataSources.LogoInsertion[\"Sweco\"].LogoTopOffset}}","verticalRelativePosition":"{{VerticalRelativePosition.Page}}","verticalAlignment":"","imageTextWrapping":"{{ImageTextWrapping.BehindText}}","rotation":"","color":"","disableUpdates":true,"type":"imageHeader"},{"propertyName":"swAttribute_Date_created","propertyValue":"{{FormatDateTime(Form.Date, Translate(\"DateFormatGeneral\"), DocumentLanguage)}}","disableUpdates":false,"type":"customDocumentProperty"},{"propertyName":"swAttribute_Version","propertyValue":"{{Form.VersionNo}}","disableUpdates":false,"type":"customDocumentProperty"},{"propertyName":"swAttribute_Document_number","propertyValue":"{{Form.DocNo}}","disableUpdates":false,"type":"customDocumentProperty"},{"propertyName":"swAttribute_Author","propertyValue":"{{Form.Author}}","disableUpdates":false,"type":"customDocumentProperty"},{"propertyName":"swAttribute_Controlled","propertyValue":"{{Form.ControlledBy}}","disableUpdates":false,"type":"customDocumentProperty"},{"propertyName":"swAttribute_Approved","propertyValue":"{{Form.ApprovedBy}}","disableUpdates":false,"type":"customDocumentProperty"},{"colorTheme":"{{DataSources.ColorThemes[\"Sweco\"].ColorTheme}}","disableUpdates":false,"originalColorThemeXml":"<a:clrScheme name=\"Sweco 2022\" xmlns:a=\"http://schemas.openxmlformats.org/drawingml/2006/main\"><a:dk1><a:srgbClr val=\"000000\" /></a:dk1><a:lt1><a:srgbClr val=\"FFFFFF\" /></a:lt1><a:dk2><a:srgbClr val=\"3F3F42\" /></a:dk2><a:lt2><a:srgbClr val=\"E2E0DA\" /></a:lt2><a:accent1><a:srgbClr val=\"A4A4A6\" /></a:accent1><a:accent2><a:srgbClr val=\"DEC55B\" /></a:accent2><a:accent3><a:srgbClr val=\"9DD354\" /></a:accent3><a:accent4><a:srgbClr val=\"C0D4FD\" /></a:accent4><a:accent5><a:srgbClr val=\"7A9B62\" /></a:accent5><a:accent6><a:srgbClr val=\"3F3F42\" /></a:accent6><a:hlink><a:srgbClr val=\"C0D4FD\" /></a:hlink><a:folHlink><a:srgbClr val=\"9DD354\" /></a:folHlink></a:clrScheme>","type":"colorTheme"},{"propertyName":"swAttribute_Date_updated","propertyValue":"","disableUpdates":false,"type":"customDocumentProperty"},{"propertyName":"swAttribute_Client_contact","propertyValue":"","disableUpdates":false,"type":"customDocumentProperty"},{"propertyName":"swAttribute_Document_description","propertyValue":"","disableUpdates":false,"type":"customDocumentProperty"},{"propertyName":"swAttribute_Document_status","propertyValue":"","disableUpdates":false,"type":"customDocumentProperty"},{"propertyName":"swAttribute_Project_phase","propertyValue":"","disableUpdates":false,"type":"customDocumentProperty"}],"templateName":"Report light","templateDescription":"Less designed standard Sweco report: with project info, logo -Portrait","enableDocumentContentUpdater":true,"version":"2.0"}]]></TemplafyTemplateConfiguration>
-</file>
-
-<file path=customXml/item6.xml><?xml version="1.0" encoding="utf-8"?>
-<AccessibilityAssistantData><![CDATA[{"Data":{}}]]></AccessibilityAssistantData>
-</file>
-
 <file path=customXml/item7.xml><?xml version="1.0" encoding="utf-8"?>
-<FormTemplates xmlns="http://schemas.microsoft.com/sharepoint/v3/contenttype/forms">
-  <Display>DocumentLibraryForm</Display>
-  <Edit>DocumentLibraryForm</Edit>
-  <New>DocumentLibraryForm</New>
-</FormTemplates>
+<TemplafyTextElementConfigurations xmlns:xsi="http://www.w3.org/2001/XMLSchema-instance" xmlns:xsd="http://www.w3.org/2001/XMLSchema">
+  <TextElement ElementMetadataLinkId="dbee4ff0-5fdf-4452-8fed-61f84e570a60" TemplateId="637836304274572432">
+    <TemplateConfiguration>{"elementsMetadata":[{"elementConfiguration":{"binding":"{{Translate(\"swLead_changelist\")}}","removeAndKeepContent":false,"disableUpdates":false,"type":"text"},"type":"richTextContentControl","id":"e2612632-f65a-4be9-a02d-e92203134553"},{"elementConfiguration":{"binding":"{{Translate(\"swLead_version\")}}","removeAndKeepContent":false,"disableUpdates":false,"type":"text"},"type":"richTextContentControl","id":"48f04f06-6045-445a-9a5e-62f816ba4bc0"},{"elementConfiguration":{"binding":"{{Translate(\"swLead_Date\")}}","removeAndKeepContent":false,"disableUpdates":false,"type":"text"},"type":"richTextContentControl","id":"0dd118e2-5f1b-4dd3-80ae-5e45854bcf20"},{"elementConfiguration":{"binding":"{{Translate(\"swLead_Descriptionchange\")}}","removeAndKeepContent":false,"disableUpdates":false,"type":"text"},"type":"richTextContentControl","id":"97593bac-5010-4ab2-ba0e-680d560fc8e5"},{"elementConfiguration":{"binding":"{{Translate(\"swLead_Reviewed\")}}","removeAndKeepContent":false,"disableUpdates":false,"type":"text"},"type":"richTextContentControl","id":"afa80ee8-d6cc-40de-8f8d-ee2dff5a78b1"},{"elementConfiguration":{"binding":"{{Translate(\"swLead_Approved\")}}","removeAndKeepContent":false,"disableUpdates":false,"type":"text"},"type":"richTextContentControl","id":"9c8600b2-795e-45ed-a4ae-4692b9da8589"}],"transformationConfigurations":[],"enableDocumentContentUpdater":false,"version":"2.0"}</TemplateConfiguration>
+    <FormConfiguration>{"formFields":[],"formDataEntries":[]}</FormConfiguration>
+  </TextElement>
+</TemplafyTextElementConfigurations>
 </file>
 
 <file path=customXml/itemProps1.xml><?xml version="1.0" encoding="utf-8"?>
-<ds:datastoreItem xmlns:ds="http://schemas.openxmlformats.org/officeDocument/2006/customXml" ds:itemID="{0D558636-8D62-47AC-961F-8E83DD257B70}">
+<ds:datastoreItem xmlns:ds="http://schemas.openxmlformats.org/officeDocument/2006/customXml" ds:itemID="{E1D85C4C-C6D0-4600-9574-5A3569B3158D}">
   <ds:schemaRefs>
-    <ds:schemaRef ds:uri="http://schemas.openxmlformats.org/officeDocument/2006/bibliography"/>
+    <ds:schemaRef ds:uri="http://schemas.microsoft.com/sharepoint/v3/contenttype/forms"/>
   </ds:schemaRefs>
 </ds:datastoreItem>
 </file>
@@ -36203,14 +36254,26 @@
 </file>
 
 <file path=customXml/itemProps3.xml><?xml version="1.0" encoding="utf-8"?>
-<ds:datastoreItem xmlns:ds="http://schemas.openxmlformats.org/officeDocument/2006/customXml" ds:itemID="{4B596CB9-4A5D-4A55-95AC-0331D87BE1AA}">
+<ds:datastoreItem xmlns:ds="http://schemas.openxmlformats.org/officeDocument/2006/customXml" ds:itemID="{0D558636-8D62-47AC-961F-8E83DD257B70}">
   <ds:schemaRefs>
-    <ds:schemaRef ds:uri="http://www.w3.org/2001/XMLSchema"/>
+    <ds:schemaRef ds:uri="http://schemas.openxmlformats.org/officeDocument/2006/bibliography"/>
   </ds:schemaRefs>
 </ds:datastoreItem>
 </file>
 
 <file path=customXml/itemProps4.xml><?xml version="1.0" encoding="utf-8"?>
+<ds:datastoreItem xmlns:ds="http://schemas.openxmlformats.org/officeDocument/2006/customXml" ds:itemID="{474F686E-FB25-4752-8F51-DB9B4B4D0E20}">
+  <ds:schemaRefs/>
+</ds:datastoreItem>
+</file>
+
+<file path=customXml/itemProps5.xml><?xml version="1.0" encoding="utf-8"?>
+<ds:datastoreItem xmlns:ds="http://schemas.openxmlformats.org/officeDocument/2006/customXml" ds:itemID="{2924ED51-5001-40C6-A364-23E342291ADE}">
+  <ds:schemaRefs/>
+</ds:datastoreItem>
+</file>
+
+<file path=customXml/itemProps6.xml><?xml version="1.0" encoding="utf-8"?>
 <ds:datastoreItem xmlns:ds="http://schemas.openxmlformats.org/officeDocument/2006/customXml" ds:itemID="{28A6A11B-4DA8-4E5B-9D48-83744E59D00C}">
   <ds:schemaRefs>
     <ds:schemaRef ds:uri="http://schemas.microsoft.com/office/2006/metadata/contentType"/>
@@ -36229,22 +36292,10 @@
 </ds:datastoreItem>
 </file>
 
-<file path=customXml/itemProps5.xml><?xml version="1.0" encoding="utf-8"?>
-<ds:datastoreItem xmlns:ds="http://schemas.openxmlformats.org/officeDocument/2006/customXml" ds:itemID="{2924ED51-5001-40C6-A364-23E342291ADE}">
-  <ds:schemaRefs/>
-</ds:datastoreItem>
-</file>
-
-<file path=customXml/itemProps6.xml><?xml version="1.0" encoding="utf-8"?>
-<ds:datastoreItem xmlns:ds="http://schemas.openxmlformats.org/officeDocument/2006/customXml" ds:itemID="{474F686E-FB25-4752-8F51-DB9B4B4D0E20}">
-  <ds:schemaRefs/>
-</ds:datastoreItem>
-</file>
-
 <file path=customXml/itemProps7.xml><?xml version="1.0" encoding="utf-8"?>
-<ds:datastoreItem xmlns:ds="http://schemas.openxmlformats.org/officeDocument/2006/customXml" ds:itemID="{E1D85C4C-C6D0-4600-9574-5A3569B3158D}">
+<ds:datastoreItem xmlns:ds="http://schemas.openxmlformats.org/officeDocument/2006/customXml" ds:itemID="{4B596CB9-4A5D-4A55-95AC-0331D87BE1AA}">
   <ds:schemaRefs>
-    <ds:schemaRef ds:uri="http://schemas.microsoft.com/sharepoint/v3/contenttype/forms"/>
+    <ds:schemaRef ds:uri="http://www.w3.org/2001/XMLSchema"/>
   </ds:schemaRefs>
 </ds:datastoreItem>
 </file>
</xml_diff>